<commit_message>
Knowledge - 8/31/2026 part 1
</commit_message>
<xml_diff>
--- a/Knowledge/1-Academic/1-school/6-Fourth Primary/1-First Term/Sources - Fourth Primary - First Term.docx
+++ b/Knowledge/1-Academic/1-school/6-Fourth Primary/1-First Term/Sources - Fourth Primary - First Term.docx
@@ -932,7 +932,23 @@
           <w:sz w:val="18"/>
           <w:szCs w:val="18"/>
         </w:rPr>
-        <w:t>english__3prim_sb_t1</w:t>
+        <w:t>english__</w:t>
+      </w:r>
+      <w:r>
+        <w:rPr>
+          <w:bCs/>
+          <w:sz w:val="18"/>
+          <w:szCs w:val="18"/>
+        </w:rPr>
+        <w:t>4</w:t>
+      </w:r>
+      <w:r>
+        <w:rPr>
+          <w:bCs/>
+          <w:sz w:val="18"/>
+          <w:szCs w:val="18"/>
+        </w:rPr>
+        <w:t>prim_sb_t1</w:t>
       </w:r>
       <w:r>
         <w:rPr>
@@ -1794,7 +1810,23 @@
           <w:sz w:val="18"/>
           <w:szCs w:val="18"/>
         </w:rPr>
-        <w:t>math_3prim_t1_e</w:t>
+        <w:t>math_</w:t>
+      </w:r>
+      <w:r>
+        <w:rPr>
+          <w:bCs/>
+          <w:sz w:val="18"/>
+          <w:szCs w:val="18"/>
+        </w:rPr>
+        <w:t>4</w:t>
+      </w:r>
+      <w:r>
+        <w:rPr>
+          <w:bCs/>
+          <w:sz w:val="18"/>
+          <w:szCs w:val="18"/>
+        </w:rPr>
+        <w:t>prim_t1_e</w:t>
       </w:r>
       <w:r>
         <w:rPr>
@@ -2608,7 +2640,31 @@
           <w:sz w:val="18"/>
           <w:szCs w:val="18"/>
         </w:rPr>
-        <w:t>deen__islamy_3prim</w:t>
+        <w:t>science_</w:t>
+      </w:r>
+      <w:r>
+        <w:rPr>
+          <w:bCs/>
+          <w:sz w:val="18"/>
+          <w:szCs w:val="18"/>
+        </w:rPr>
+        <w:t>4</w:t>
+      </w:r>
+      <w:r>
+        <w:rPr>
+          <w:bCs/>
+          <w:sz w:val="18"/>
+          <w:szCs w:val="18"/>
+        </w:rPr>
+        <w:t>prim_t1_</w:t>
+      </w:r>
+      <w:r>
+        <w:rPr>
+          <w:bCs/>
+          <w:sz w:val="18"/>
+          <w:szCs w:val="18"/>
+        </w:rPr>
+        <w:t>e</w:t>
       </w:r>
       <w:r>
         <w:rPr>
@@ -3421,7 +3477,39 @@
           <w:sz w:val="18"/>
           <w:szCs w:val="18"/>
         </w:rPr>
-        <w:t xml:space="preserve">[deen__islamy_3prim.pdf -&gt; </w:t>
+        <w:t>[</w:t>
+      </w:r>
+      <w:r>
+        <w:rPr>
+          <w:bCs/>
+          <w:sz w:val="18"/>
+          <w:szCs w:val="18"/>
+        </w:rPr>
+        <w:t>drasat_</w:t>
+      </w:r>
+      <w:r>
+        <w:rPr>
+          <w:bCs/>
+          <w:sz w:val="18"/>
+          <w:szCs w:val="18"/>
+        </w:rPr>
+        <w:t>4</w:t>
+      </w:r>
+      <w:r>
+        <w:rPr>
+          <w:bCs/>
+          <w:sz w:val="18"/>
+          <w:szCs w:val="18"/>
+        </w:rPr>
+        <w:t>prim_t1</w:t>
+      </w:r>
+      <w:r>
+        <w:rPr>
+          <w:bCs/>
+          <w:sz w:val="18"/>
+          <w:szCs w:val="18"/>
+        </w:rPr>
+        <w:t xml:space="preserve">.pdf -&gt; </w:t>
       </w:r>
       <w:r>
         <w:rPr>
@@ -4177,6 +4265,46 @@
           <w:sz w:val="18"/>
           <w:szCs w:val="18"/>
         </w:rPr>
+        <w:t>43</w:t>
+      </w:r>
+      <w:r>
+        <w:rPr>
+          <w:sz w:val="18"/>
+          <w:szCs w:val="18"/>
+        </w:rPr>
+        <w:br/>
+        <w:t>*</w:t>
+      </w:r>
+      <w:r>
+        <w:rPr>
+          <w:b/>
+          <w:sz w:val="18"/>
+          <w:szCs w:val="18"/>
+        </w:rPr>
+        <w:t xml:space="preserve"> Content Title: </w:t>
+      </w:r>
+      <w:r>
+        <w:rPr>
+          <w:bCs/>
+          <w:sz w:val="18"/>
+          <w:szCs w:val="18"/>
+        </w:rPr>
+        <w:t>[</w:t>
+      </w:r>
+      <w:r>
+        <w:rPr>
+          <w:bCs/>
+          <w:sz w:val="18"/>
+          <w:szCs w:val="18"/>
+        </w:rPr>
+        <w:t>deen__islamy_</w:t>
+      </w:r>
+      <w:r>
+        <w:rPr>
+          <w:bCs/>
+          <w:sz w:val="18"/>
+          <w:szCs w:val="18"/>
+        </w:rPr>
         <w:t>4</w:t>
       </w:r>
       <w:r>
@@ -4185,39 +4313,7 @@
           <w:sz w:val="18"/>
           <w:szCs w:val="18"/>
         </w:rPr>
-        <w:t>3</w:t>
-      </w:r>
-      <w:r>
-        <w:rPr>
-          <w:sz w:val="18"/>
-          <w:szCs w:val="18"/>
-        </w:rPr>
-        <w:br/>
-        <w:t>*</w:t>
-      </w:r>
-      <w:r>
-        <w:rPr>
-          <w:b/>
-          <w:sz w:val="18"/>
-          <w:szCs w:val="18"/>
-        </w:rPr>
-        <w:t xml:space="preserve"> Content Title: </w:t>
-      </w:r>
-      <w:r>
-        <w:rPr>
-          <w:bCs/>
-          <w:sz w:val="18"/>
-          <w:szCs w:val="18"/>
-        </w:rPr>
-        <w:t>[</w:t>
-      </w:r>
-      <w:r>
-        <w:rPr>
-          <w:bCs/>
-          <w:sz w:val="18"/>
-          <w:szCs w:val="18"/>
-        </w:rPr>
-        <w:t>deen__islamy_3prim</w:t>
+        <w:t>prim</w:t>
       </w:r>
       <w:r>
         <w:rPr>

</xml_diff>